<commit_message>
Updating project report doc
</commit_message>
<xml_diff>
--- a/Part 3 - Critical Reflection Report.docx
+++ b/Part 3 - Critical Reflection Report.docx
@@ -18,6 +18,87 @@
         </w:rPr>
         <w:t>Part 3: Critical Reflection Report</w:t>
       </w:r>
+    </w:p>
+    <w:p>
+      <w:pPr>
+        <w:rPr>
+          <w:rFonts w:ascii="Calibri" w:hAnsi="Calibri" w:cs="Calibri"/>
+          <w:sz w:val="96"/>
+          <w:szCs w:val="96"/>
+        </w:rPr>
+      </w:pPr>
+    </w:p>
+    <w:p>
+      <w:pPr>
+        <w:rPr>
+          <w:rFonts w:ascii="Calibri" w:hAnsi="Calibri" w:cs="Calibri"/>
+          <w:sz w:val="96"/>
+          <w:szCs w:val="96"/>
+        </w:rPr>
+      </w:pPr>
+    </w:p>
+    <w:p>
+      <w:pPr>
+        <w:rPr>
+          <w:rFonts w:ascii="Calibri" w:hAnsi="Calibri" w:cs="Calibri"/>
+          <w:sz w:val="96"/>
+          <w:szCs w:val="96"/>
+        </w:rPr>
+      </w:pPr>
+    </w:p>
+    <w:p>
+      <w:pPr>
+        <w:rPr>
+          <w:rFonts w:ascii="Calibri" w:hAnsi="Calibri" w:cs="Calibri"/>
+          <w:sz w:val="96"/>
+          <w:szCs w:val="96"/>
+        </w:rPr>
+      </w:pPr>
+    </w:p>
+    <w:p>
+      <w:pPr>
+        <w:rPr>
+          <w:rFonts w:ascii="Calibri" w:hAnsi="Calibri" w:cs="Calibri"/>
+          <w:sz w:val="96"/>
+          <w:szCs w:val="96"/>
+        </w:rPr>
+      </w:pPr>
+    </w:p>
+    <w:p>
+      <w:pPr>
+        <w:rPr>
+          <w:rFonts w:ascii="Calibri" w:hAnsi="Calibri" w:cs="Calibri"/>
+          <w:sz w:val="96"/>
+          <w:szCs w:val="96"/>
+        </w:rPr>
+      </w:pPr>
+    </w:p>
+    <w:p>
+      <w:pPr>
+        <w:rPr>
+          <w:rFonts w:ascii="Calibri" w:hAnsi="Calibri" w:cs="Calibri"/>
+          <w:sz w:val="96"/>
+          <w:szCs w:val="96"/>
+        </w:rPr>
+      </w:pPr>
+    </w:p>
+    <w:p>
+      <w:pPr>
+        <w:rPr>
+          <w:rFonts w:ascii="Calibri" w:hAnsi="Calibri" w:cs="Calibri"/>
+          <w:sz w:val="22"/>
+          <w:szCs w:val="22"/>
+        </w:rPr>
+      </w:pPr>
+    </w:p>
+    <w:p>
+      <w:pPr>
+        <w:rPr>
+          <w:rFonts w:ascii="Calibri" w:hAnsi="Calibri" w:cs="Calibri"/>
+          <w:sz w:val="22"/>
+          <w:szCs w:val="22"/>
+        </w:rPr>
+      </w:pPr>
     </w:p>
     <w:sectPr>
       <w:pgSz w:w="11906" w:h="16838"/>

</xml_diff>